<commit_message>
Add faculty name and submission date to the report cover page
The assignment information table on page 1 was missing two fields the brief's
cover sheet asks for:

  Faculty Name        Dr. Priskilla Angel Rani .J
  Date of Submission  02 / 09 / 2026

Both are added to docs/report cover and mirrored in the README summary table so
the two do not drift apart. The document was rebuilt through the two-pass
driver, so the contents-page numbers were re-measured against the new layout
rather than carried over.
</commit_message>
<xml_diff>
--- a/docs/CSA04_OS_Assignment_CO3_CO4_CO5_Tharunkumar_S_192511416.docx
+++ b/docs/CSA04_OS_Assignment_CO3_CO4_CO5_Tharunkumar_S_192511416.docx
@@ -350,7 +350,7 @@
                 <w:b w:val="0"/>
                 <w:sz w:val="18"/>
               </w:rPr>
-              <w:t>Assignment Title</w:t>
+              <w:t>Faculty Name</w:t>
             </w:r>
           </w:p>
         </w:tc>
@@ -368,7 +368,7 @@
                 <w:b w:val="0"/>
                 <w:sz w:val="18"/>
               </w:rPr>
-              <w:t>Design, Memory Optimization, and System Administration of an Enterprise Cloud &amp; Virtualization Platform</w:t>
+              <w:t>Dr. Priskilla Angel Rani .J</w:t>
             </w:r>
           </w:p>
         </w:tc>
@@ -389,7 +389,7 @@
                 <w:b w:val="0"/>
                 <w:sz w:val="18"/>
               </w:rPr>
-              <w:t>Course Outcomes</w:t>
+              <w:t>Assignment Title</w:t>
             </w:r>
           </w:p>
         </w:tc>
@@ -408,7 +408,7 @@
                 <w:b w:val="0"/>
                 <w:sz w:val="18"/>
               </w:rPr>
-              <w:t>CO3 — Virtual memory and paging;  CO4 — File systems, inode dynamics and disk scheduling;  CO5 — Linux administration, network services and virtualization</w:t>
+              <w:t>Design, Memory Optimization, and System Administration of an Enterprise Cloud &amp; Virtualization Platform</w:t>
             </w:r>
           </w:p>
         </w:tc>
@@ -428,7 +428,7 @@
                 <w:b w:val="0"/>
                 <w:sz w:val="18"/>
               </w:rPr>
-              <w:t>Bloom's Taxonomy Level</w:t>
+              <w:t>Course Outcomes</w:t>
             </w:r>
           </w:p>
         </w:tc>
@@ -446,7 +446,7 @@
                 <w:b w:val="0"/>
                 <w:sz w:val="18"/>
               </w:rPr>
-              <w:t>L3 — Apply;  L4 — Analyse;  L5 — Evaluate</w:t>
+              <w:t>CO3 — Virtual memory and paging;  CO4 — File systems, inode dynamics and disk scheduling;  CO5 — Linux administration, network services and virtualization</w:t>
             </w:r>
           </w:p>
         </w:tc>
@@ -467,7 +467,7 @@
                 <w:b w:val="0"/>
                 <w:sz w:val="18"/>
               </w:rPr>
-              <w:t>SDG Mapping</w:t>
+              <w:t>Bloom's Taxonomy Level</w:t>
             </w:r>
           </w:p>
         </w:tc>
@@ -486,7 +486,85 @@
                 <w:b w:val="0"/>
                 <w:sz w:val="18"/>
               </w:rPr>
+              <w:t>L3 — Apply;  L4 — Analyse;  L5 — Evaluate</w:t>
+            </w:r>
+          </w:p>
+        </w:tc>
+      </w:tr>
+      <w:tr>
+        <w:tc>
+          <w:tcPr>
+            <w:tcW w:type="dxa" w:w="2736"/>
+          </w:tcPr>
+          <w:p>
+            <w:pPr>
+              <w:jc w:val="left"/>
+            </w:pPr>
+            <w:r/>
+            <w:r>
+              <w:rPr>
+                <w:b w:val="0"/>
+                <w:sz w:val="18"/>
+              </w:rPr>
+              <w:t>SDG Mapping</w:t>
+            </w:r>
+          </w:p>
+        </w:tc>
+        <w:tc>
+          <w:tcPr>
+            <w:tcW w:type="dxa" w:w="6624"/>
+          </w:tcPr>
+          <w:p>
+            <w:pPr>
+              <w:jc w:val="center"/>
+            </w:pPr>
+            <w:r/>
+            <w:r>
+              <w:rPr>
+                <w:b w:val="0"/>
+                <w:sz w:val="18"/>
+              </w:rPr>
               <w:t>SDG 7 — Affordable and Clean Energy;  SDG 9 — Industry, Innovation and Infrastructure;  SDG 11 — Sustainable Cities</w:t>
+            </w:r>
+          </w:p>
+        </w:tc>
+      </w:tr>
+      <w:tr>
+        <w:tc>
+          <w:tcPr>
+            <w:tcW w:type="dxa" w:w="2736"/>
+            <w:shd w:val="clear" w:fill="F2F6FA"/>
+          </w:tcPr>
+          <w:p>
+            <w:pPr>
+              <w:jc w:val="left"/>
+            </w:pPr>
+            <w:r/>
+            <w:r>
+              <w:rPr>
+                <w:b w:val="0"/>
+                <w:sz w:val="18"/>
+              </w:rPr>
+              <w:t>Date of Submission</w:t>
+            </w:r>
+          </w:p>
+        </w:tc>
+        <w:tc>
+          <w:tcPr>
+            <w:tcW w:type="dxa" w:w="6624"/>
+            <w:shd w:val="clear" w:fill="F2F6FA"/>
+          </w:tcPr>
+          <w:p>
+            <w:pPr>
+              <w:jc w:val="center"/>
+            </w:pPr>
+            <w:r/>
+            <w:r>
+              <w:rPr>
+                <w:b w:val="0"/>
+                <w:sz w:val="18"/>
+              </w:rPr>
+              <w:t>02 / 09 / 2026</w:t>
             </w:r>
           </w:p>
         </w:tc>

</xml_diff>